<commit_message>
docs(field-note): record the Aegis Pilot price correction in the branch records
The learning-outcome record and the branch handoff still described the pilot at
EUR 45,000 and the handoff still carried Q6 as open — both stale after 0a791c7.

- Field note v1.1 -> v1.2: retains the misread (April three-phase programme total
  read as a pilot line) per Rule 12 and records the corrected two-SKU structure,
  the credit arithmetic, and the wording guard.
- Handoff: Q6 marked answered (deployment modes, not tiers) with the engineering
  dependency that survives it; adds the pilot SKU section with both guards; sets
  the branch HIC question counter to Q7.
- Learn/ HTML + docx regenerated from the corrected note.

Co-Authored-By: Claude Opus 5 <noreply@anthropic.com>
Claude-Session: https://claude.ai/code/session_01VNPr3nCM6eS3vt4NyG1jBz
</commit_message>
<xml_diff>
--- a/Learn/2026-07-30-network-independent-critical-operation.docx
+++ b/Learn/2026-07-30-network-independent-critical-operation.docx
@@ -1356,7 +1356,34 @@
         <w:t xml:space="preserve">existing customer hardware or a small edge appliance, before any DGX procurement</w:t>
       </w:r>
       <w:r>
-        <w:t xml:space="preserve">. Hardware scale-up is a decision the pilot informs, not a precondition for starting. Reference scope ~€45K over three months (April 2026 engagement model,</w:t>
+        <w:t xml:space="preserve">. Hardware scale-up is a decision the pilot informs, not a precondition for starting.</w:t>
+      </w:r>
+    </w:p>
+    <w:p>
+      <w:pPr>
+        <w:pStyle w:val="BodyText"/>
+      </w:pPr>
+      <w:r>
+        <w:rPr>
+          <w:bCs/>
+          <w:b/>
+        </w:rPr>
+        <w:t xml:space="preserve">Price correction, same day (v1.2).</w:t>
+      </w:r>
+      <w:r>
+        <w:t xml:space="preserve"> </w:t>
+      </w:r>
+      <w:r>
+        <w:t xml:space="preserve">This note originally cited</w:t>
+      </w:r>
+      <w:r>
+        <w:t xml:space="preserve"> </w:t>
+      </w:r>
+      <w:r>
+        <w:t xml:space="preserve">“</w:t>
+      </w:r>
+      <w:r>
+        <w:t xml:space="preserve">reference scope ~€45K over three months (April 2026 engagement model,</w:t>
       </w:r>
       <w:r>
         <w:t xml:space="preserve"> </w:t>
@@ -1368,7 +1395,13 @@
         <w:t xml:space="preserve">.claude/archive/2026-04-15/...dws-iq-aegis-lwm-strategy.md</w:t>
       </w:r>
       <w:r>
-        <w:t xml:space="preserve">); any live offer figure belongs in</w:t>
+        <w:t xml:space="preserve">)</w:t>
+      </w:r>
+      <w:r>
+        <w:t xml:space="preserve">”</w:t>
+      </w:r>
+      <w:r>
+        <w:t xml:space="preserve">, and</w:t>
       </w:r>
       <w:r>
         <w:t xml:space="preserve"> </w:t>
@@ -1377,10 +1410,413 @@
         <w:rPr>
           <w:rStyle w:val="VerbatimChar"/>
         </w:rPr>
+        <w:t xml:space="preserve">DWS-AEGIS-PILOT-001</w:t>
+      </w:r>
+      <w:r>
+        <w:t xml:space="preserve"> </w:t>
+      </w:r>
+      <w:r>
+        <w:t xml:space="preserve">shipped at €45,000 in</w:t>
+      </w:r>
+      <w:r>
+        <w:t xml:space="preserve"> </w:t>
+      </w:r>
+      <w:r>
+        <w:rPr>
+          <w:rStyle w:val="VerbatimChar"/>
+        </w:rPr>
+        <w:t xml:space="preserve">5ed749f</w:t>
+      </w:r>
+      <w:r>
+        <w:t xml:space="preserve"> </w:t>
+      </w:r>
+      <w:r>
+        <w:t xml:space="preserve">on that basis.</w:t>
+      </w:r>
+      <w:r>
+        <w:t xml:space="preserve"> </w:t>
+      </w:r>
+      <w:r>
+        <w:rPr>
+          <w:bCs/>
+          <w:b/>
+        </w:rPr>
+        <w:t xml:space="preserve">That was a misread and is retained here per Rule 12.</w:t>
+      </w:r>
+      <w:r>
+        <w:t xml:space="preserve"> </w:t>
+      </w:r>
+      <w:r>
+        <w:t xml:space="preserve">The April figure is a</w:t>
+      </w:r>
+      <w:r>
+        <w:t xml:space="preserve"> </w:t>
+      </w:r>
+      <w:r>
+        <w:rPr>
+          <w:iCs/>
+          <w:i/>
+        </w:rPr>
+        <w:t xml:space="preserve">three-phase programme total</w:t>
+      </w:r>
+      <w:r>
+        <w:t xml:space="preserve"> </w:t>
+      </w:r>
+      <w:r>
+        <w:t xml:space="preserve">— Audit 2wk €5,000 + agent-in-production 6wk €15,000 + LWM integration 8wk €25,000 — and it is</w:t>
+      </w:r>
+      <w:r>
+        <w:t xml:space="preserve"> </w:t>
+      </w:r>
+      <w:r>
+        <w:rPr>
+          <w:bCs/>
+          <w:b/>
+        </w:rPr>
+        <w:t xml:space="preserve">additive</w:t>
+      </w:r>
+      <w:r>
+        <w:t xml:space="preserve"> </w:t>
+      </w:r>
+      <w:r>
+        <w:t xml:space="preserve">to the licence, not a pilot price. Only the middle phase is a pilot. Two things followed from the error: a</w:t>
+      </w:r>
+      <w:r>
+        <w:t xml:space="preserve"> </w:t>
+      </w:r>
+      <w:r>
+        <w:t xml:space="preserve">“</w:t>
+      </w:r>
+      <w:r>
+        <w:t xml:space="preserve">pilot</w:t>
+      </w:r>
+      <w:r>
+        <w:t xml:space="preserve">”</w:t>
+      </w:r>
+      <w:r>
+        <w:t xml:space="preserve"> </w:t>
+      </w:r>
+      <w:r>
+        <w:t xml:space="preserve">at 75% of the €59,990 onboarding is the product under a lower-commitment name, and crediting €45,000 in full leaves €14,990 for a fleet rollout across 21 industries, which is not deliverable.</w:t>
+      </w:r>
+    </w:p>
+    <w:p>
+      <w:pPr>
+        <w:pStyle w:val="BodyText"/>
+      </w:pPr>
+      <w:r>
+        <w:rPr>
+          <w:bCs/>
+          <w:b/>
+        </w:rPr>
+        <w:t xml:space="preserve">Corrected in</w:t>
+      </w:r>
+      <w:r>
+        <w:rPr>
+          <w:bCs/>
+          <w:b/>
+        </w:rPr>
+        <w:t xml:space="preserve"> </w:t>
+      </w:r>
+      <w:r>
+        <w:rPr>
+          <w:rStyle w:val="VerbatimChar"/>
+          <w:bCs/>
+          <w:b/>
+        </w:rPr>
+        <w:t xml:space="preserve">0a791c7</w:t>
+      </w:r>
+      <w:r>
+        <w:rPr>
+          <w:bCs/>
+          <w:b/>
+        </w:rPr>
+        <w:t xml:space="preserve">, on HIC approval:</w:t>
+      </w:r>
+    </w:p>
+    <w:tbl>
+      <w:tblPr>
+        <w:tblStyle w:val="Table"/>
+        <w:tblW w:type="pct" w:w="5000"/>
+        <w:tblLook w:firstRow="1" w:lastRow="0" w:firstColumn="0" w:lastColumn="0" w:noHBand="0" w:noVBand="0" w:val="0020"/>
+        <w:jc w:val="start"/>
+      </w:tblPr>
+      <w:tblGrid>
+        <w:gridCol w:w="2640"/>
+        <w:gridCol w:w="2640"/>
+        <w:gridCol w:w="2640"/>
+      </w:tblGrid>
+      <w:tr>
+        <w:trPr>
+          <w:tblHeader w:val="true"/>
+        </w:trPr>
+        <w:tc>
+          <w:tcPr/>
+          <w:p>
+            <w:pPr>
+              <w:pStyle w:val="Compact"/>
+              <w:jc w:val="left"/>
+            </w:pPr>
+            <w:r>
+              <w:t xml:space="preserve">SKU</w:t>
+            </w:r>
+          </w:p>
+        </w:tc>
+        <w:tc>
+          <w:tcPr/>
+          <w:p>
+            <w:pPr>
+              <w:pStyle w:val="Compact"/>
+              <w:jc w:val="left"/>
+            </w:pPr>
+            <w:r>
+              <w:t xml:space="preserve">Price</w:t>
+            </w:r>
+          </w:p>
+        </w:tc>
+        <w:tc>
+          <w:tcPr/>
+          <w:p>
+            <w:pPr>
+              <w:pStyle w:val="Compact"/>
+              <w:jc w:val="left"/>
+            </w:pPr>
+            <w:r>
+              <w:t xml:space="preserve">Credited?</w:t>
+            </w:r>
+          </w:p>
+        </w:tc>
+      </w:tr>
+      <w:tr>
+        <w:tc>
+          <w:tcPr/>
+          <w:p>
+            <w:pPr>
+              <w:pStyle w:val="Compact"/>
+              <w:jc w:val="left"/>
+            </w:pPr>
+            <w:r>
+              <w:rPr>
+                <w:rStyle w:val="VerbatimChar"/>
+              </w:rPr>
+              <w:t xml:space="preserve">DWS-AEGIS-PILOT-001</w:t>
+            </w:r>
+            <w:r>
+              <w:t xml:space="preserve"> </w:t>
+            </w:r>
+            <w:r>
+              <w:t xml:space="preserve">— Aegis Pilot, 3 months</w:t>
+            </w:r>
+          </w:p>
+        </w:tc>
+        <w:tc>
+          <w:tcPr/>
+          <w:p>
+            <w:pPr>
+              <w:pStyle w:val="Compact"/>
+              <w:jc w:val="left"/>
+            </w:pPr>
+            <w:r>
+              <w:rPr>
+                <w:bCs/>
+                <w:b/>
+              </w:rPr>
+              <w:t xml:space="preserve">€19,990</w:t>
+            </w:r>
+          </w:p>
+        </w:tc>
+        <w:tc>
+          <w:tcPr/>
+          <w:p>
+            <w:pPr>
+              <w:pStyle w:val="Compact"/>
+              <w:jc w:val="left"/>
+            </w:pPr>
+            <w:r>
+              <w:t xml:space="preserve">Yes, in full against €59,990 onboarding, within 6 months, capped at €19,990</w:t>
+            </w:r>
+          </w:p>
+        </w:tc>
+      </w:tr>
+      <w:tr>
+        <w:tc>
+          <w:tcPr/>
+          <w:p>
+            <w:pPr>
+              <w:pStyle w:val="Compact"/>
+              <w:jc w:val="left"/>
+            </w:pPr>
+            <w:r>
+              <w:rPr>
+                <w:rStyle w:val="VerbatimChar"/>
+              </w:rPr>
+              <w:t xml:space="preserve">DWS-AEGIS-IMPL-001</w:t>
+            </w:r>
+            <w:r>
+              <w:t xml:space="preserve"> </w:t>
+            </w:r>
+            <w:r>
+              <w:t xml:space="preserve">— Aegis Implementation Programme, 3 phases</w:t>
+            </w:r>
+          </w:p>
+        </w:tc>
+        <w:tc>
+          <w:tcPr/>
+          <w:p>
+            <w:pPr>
+              <w:pStyle w:val="Compact"/>
+              <w:jc w:val="left"/>
+            </w:pPr>
+            <w:r>
+              <w:t xml:space="preserve">€45,000</w:t>
+            </w:r>
+          </w:p>
+        </w:tc>
+        <w:tc>
+          <w:tcPr/>
+          <w:p>
+            <w:pPr>
+              <w:pStyle w:val="Compact"/>
+              <w:jc w:val="left"/>
+            </w:pPr>
+            <w:r>
+              <w:rPr>
+                <w:bCs/>
+                <w:b/>
+              </w:rPr>
+              <w:t xml:space="preserve">No</w:t>
+            </w:r>
+            <w:r>
+              <w:t xml:space="preserve"> </w:t>
+            </w:r>
+            <w:r>
+              <w:t xml:space="preserve">— additive. Phase 3 (LWM integration) is work onboarding does not contain, so crediting it would charge once for two pieces of work</w:t>
+            </w:r>
+          </w:p>
+        </w:tc>
+      </w:tr>
+    </w:tbl>
+    <w:p>
+      <w:pPr>
+        <w:pStyle w:val="BodyText"/>
+      </w:pPr>
+      <w:r>
+        <w:t xml:space="preserve">The word</w:t>
+      </w:r>
+      <w:r>
+        <w:t xml:space="preserve"> </w:t>
+      </w:r>
+      <w:r>
+        <w:t xml:space="preserve">“</w:t>
+      </w:r>
+      <w:r>
+        <w:t xml:space="preserve">pilot</w:t>
+      </w:r>
+      <w:r>
+        <w:t xml:space="preserve">”</w:t>
+      </w:r>
+      <w:r>
+        <w:t xml:space="preserve"> </w:t>
+      </w:r>
+      <w:r>
+        <w:t xml:space="preserve">appears nowhere in the implementation SKU’s id, mpn, name, title or frontmatter — that ambiguity is what produced the error, and it must not be re-introducible by autocomplete. The live figure remains sourced from</w:t>
+      </w:r>
+      <w:r>
+        <w:t xml:space="preserve"> </w:t>
+      </w:r>
+      <w:r>
+        <w:rPr>
+          <w:rStyle w:val="VerbatimChar"/>
+        </w:rPr>
         <w:t xml:space="preserve">dws10.com/config/products.json</w:t>
       </w:r>
       <w:r>
-        <w:t xml:space="preserve">.</w:t>
+        <w:t xml:space="preserve"> </w:t>
+      </w:r>
+      <w:r>
+        <w:t xml:space="preserve">(</w:t>
+      </w:r>
+      <w:r>
+        <w:rPr>
+          <w:rStyle w:val="VerbatimChar"/>
+        </w:rPr>
+        <w:t xml:space="preserve">priceVersion</w:t>
+      </w:r>
+      <w:r>
+        <w:t xml:space="preserve"> </w:t>
+      </w:r>
+      <w:r>
+        <w:t xml:space="preserve">1.25, cause recorded in</w:t>
+      </w:r>
+      <w:r>
+        <w:t xml:space="preserve"> </w:t>
+      </w:r>
+      <w:r>
+        <w:rPr>
+          <w:rStyle w:val="VerbatimChar"/>
+        </w:rPr>
+        <w:t xml:space="preserve">priceHistory</w:t>
+      </w:r>
+      <w:r>
+        <w:t xml:space="preserve">), never from this note.</w:t>
+      </w:r>
+    </w:p>
+    <w:p>
+      <w:pPr>
+        <w:pStyle w:val="BodyText"/>
+      </w:pPr>
+      <w:r>
+        <w:rPr>
+          <w:bCs/>
+          <w:b/>
+        </w:rPr>
+        <w:t xml:space="preserve">The wording guard the HIC required</w:t>
+      </w:r>
+      <w:r>
+        <w:t xml:space="preserve">, present in both</w:t>
+      </w:r>
+      <w:r>
+        <w:t xml:space="preserve"> </w:t>
+      </w:r>
+      <w:r>
+        <w:rPr>
+          <w:rStyle w:val="VerbatimChar"/>
+        </w:rPr>
+        <w:t xml:space="preserve">products.json</w:t>
+      </w:r>
+      <w:r>
+        <w:t xml:space="preserve"> </w:t>
+      </w:r>
+      <w:r>
+        <w:t xml:space="preserve">and</w:t>
+      </w:r>
+      <w:r>
+        <w:t xml:space="preserve"> </w:t>
+      </w:r>
+      <w:r>
+        <w:rPr>
+          <w:rStyle w:val="VerbatimChar"/>
+        </w:rPr>
+        <w:t xml:space="preserve">Store/PRODUCT_AEGIS_PILOT.md</w:t>
+      </w:r>
+      <w:r>
+        <w:t xml:space="preserve">: what the €19,990 includes (one site, one control-room workflow, one deployment-mode recommendation, that workflow’s agent set only, local execution/evidence/identity/logs/kill authority on existing or edge hardware, production sizing from measured behaviour); the</w:t>
+      </w:r>
+      <w:r>
+        <w:t xml:space="preserve"> </w:t>
+      </w:r>
+      <w:r>
+        <w:rPr>
+          <w:bCs/>
+          <w:b/>
+        </w:rPr>
+        <w:t xml:space="preserve">binary acceptance KPI</w:t>
+      </w:r>
+      <w:r>
+        <w:t xml:space="preserve"> </w:t>
+      </w:r>
+      <w:r>
+        <w:t xml:space="preserve">(uplink severed → workflow completes, Article 12 record still written locally, operator can still stop a running agent — all three, or it is a delivered negative result); and what sits outside the credit (LWM integration, hardware, multi-site, other industries, custom ERP/BIM, the implementation programme).</w:t>
       </w:r>
     </w:p>
     <w:p>

</xml_diff>